<commit_message>
Atualizar campos Ano letivo e Tipo de matrícula para valores fixos e desabilitados
</commit_message>
<xml_diff>
--- a/template.docx
+++ b/template.docx
@@ -32035,8 +32035,6 @@
             </w:r>
             <w:r>
               <w:rPr>
-                <w:rFonts w:ascii="Arial" w:hAnsi="Arial" w:cs="Arial"/>
-                <w:color w:val="000000"/>
                 <w:sz w:val="18"/>
                 <w:szCs w:val="18"/>
               </w:rPr>
@@ -32045,8 +32043,6 @@
             <w:proofErr w:type="spellStart"/>
             <w:r>
               <w:rPr>
-                <w:rFonts w:ascii="Arial" w:hAnsi="Arial" w:cs="Arial"/>
-                <w:color w:val="000000"/>
                 <w:sz w:val="18"/>
                 <w:szCs w:val="18"/>
               </w:rPr>
@@ -32055,8 +32051,6 @@
             <w:proofErr w:type="spellEnd"/>
             <w:r>
               <w:rPr>
-                <w:rFonts w:ascii="Arial" w:hAnsi="Arial" w:cs="Arial"/>
-                <w:color w:val="000000"/>
                 <w:sz w:val="18"/>
                 <w:szCs w:val="18"/>
               </w:rPr>
@@ -32064,12 +32058,10 @@
             </w:r>
             <w:r>
               <w:rPr>
-                <w:rFonts w:ascii="Arial" w:hAnsi="Arial" w:cs="Arial"/>
-                <w:color w:val="000000"/>
                 <w:sz w:val="18"/>
                 <w:szCs w:val="18"/>
               </w:rPr>
-              <w:t>,</w:t>
+              <w:t xml:space="preserve"> </w:t>
             </w:r>
             <w:r>
               <w:rPr>
@@ -32078,7 +32070,7 @@
                 <w:sz w:val="18"/>
                 <w:szCs w:val="18"/>
               </w:rPr>
-              <w:t xml:space="preserve"> </w:t>
+              <w:t xml:space="preserve">, </w:t>
             </w:r>
             <w:r>
               <w:rPr>
@@ -32125,16 +32117,7 @@
                 <w:sz w:val="18"/>
                 <w:szCs w:val="18"/>
               </w:rPr>
-              <w:t xml:space="preserve"> </w:t>
-            </w:r>
-            <w:r>
-              <w:rPr>
-                <w:rFonts w:ascii="Arial" w:hAnsi="Arial" w:cs="Arial"/>
-                <w:color w:val="000000"/>
-                <w:sz w:val="18"/>
-                <w:szCs w:val="18"/>
-              </w:rPr>
-              <w:t xml:space="preserve"> </w:t>
+              <w:t xml:space="preserve">  </w:t>
             </w:r>
             <w:r>
               <w:rPr>

</xml_diff>

<commit_message>
Remover campos de saúde duplicados da seção do aluno e destacar checkbox de responsável
- Remove plano de saúde, nº carteirinha, médico e tel. do médico da seção do aluno (já existem na seção Saúde)
- Substitui checkbox simples por banner estilizado com destaque visual e mudança de cor ao selecionar

Co-Authored-By: Claude Sonnet 4.6 <noreply@anthropic.com>
</commit_message>
<xml_diff>
--- a/template.docx
+++ b/template.docx
@@ -3520,7 +3520,7 @@
       </w:tr>
       <w:tr>
         <w:trPr>
-          <w:trHeight w:hRule="exact" w:val="271"/>
+          <w:trHeight w:hRule="exact" w:val="615"/>
         </w:trPr>
         <w:tc>
           <w:tcPr>
@@ -3818,7 +3818,7 @@
       </w:tr>
       <w:tr>
         <w:trPr>
-          <w:trHeight w:hRule="exact" w:val="194"/>
+          <w:trHeight w:hRule="exact" w:val="142"/>
         </w:trPr>
         <w:tc>
           <w:tcPr>
@@ -9993,7 +9993,7 @@
       </w:tr>
       <w:tr>
         <w:trPr>
-          <w:trHeight w:hRule="exact" w:val="140"/>
+          <w:trHeight w:hRule="exact" w:val="399"/>
         </w:trPr>
         <w:tc>
           <w:tcPr>
@@ -10083,7 +10083,25 @@
                 <w:sz w:val="14"/>
                 <w:szCs w:val="14"/>
               </w:rPr>
-              <w:t>{{filiacao2_uf}}</w:t>
+              <w:t>{{filiacao</w:t>
+            </w:r>
+            <w:r>
+              <w:rPr>
+                <w:rFonts w:ascii="Arial" w:hAnsi="Arial" w:cs="Arial"/>
+                <w:color w:val="000000"/>
+                <w:sz w:val="14"/>
+                <w:szCs w:val="14"/>
+              </w:rPr>
+              <w:t>1</w:t>
+            </w:r>
+            <w:r>
+              <w:rPr>
+                <w:rFonts w:ascii="Arial" w:hAnsi="Arial" w:cs="Arial"/>
+                <w:color w:val="000000"/>
+                <w:sz w:val="14"/>
+                <w:szCs w:val="14"/>
+              </w:rPr>
+              <w:t>_uf}}</w:t>
             </w:r>
           </w:p>
         </w:tc>
@@ -11501,15 +11519,15 @@
               <w:spacing w:after="0" w:line="240" w:lineRule="auto"/>
               <w:rPr>
                 <w:rFonts w:ascii="Arial" w:hAnsi="Arial" w:cs="Arial"/>
-                <w:sz w:val="9"/>
-                <w:szCs w:val="9"/>
-              </w:rPr>
-            </w:pPr>
-            <w:r>
-              <w:rPr>
-                <w:rFonts w:ascii="Arial" w:hAnsi="Arial" w:cs="Arial"/>
-                <w:sz w:val="9"/>
-                <w:szCs w:val="9"/>
+                <w:sz w:val="16"/>
+                <w:szCs w:val="16"/>
+              </w:rPr>
+            </w:pPr>
+            <w:r>
+              <w:rPr>
+                <w:rFonts w:ascii="Arial" w:hAnsi="Arial" w:cs="Arial"/>
+                <w:sz w:val="16"/>
+                <w:szCs w:val="16"/>
               </w:rPr>
               <w:t>{{filiacao2_nacionalidade}}</w:t>
             </w:r>
@@ -12116,15 +12134,15 @@
               <w:spacing w:after="0" w:line="240" w:lineRule="auto"/>
               <w:rPr>
                 <w:rFonts w:ascii="Arial" w:hAnsi="Arial" w:cs="Arial"/>
-                <w:sz w:val="9"/>
-                <w:szCs w:val="9"/>
-              </w:rPr>
-            </w:pPr>
-            <w:r>
-              <w:rPr>
-                <w:rFonts w:ascii="Arial" w:hAnsi="Arial" w:cs="Arial"/>
-                <w:sz w:val="9"/>
-                <w:szCs w:val="9"/>
+                <w:sz w:val="16"/>
+                <w:szCs w:val="16"/>
+              </w:rPr>
+            </w:pPr>
+            <w:r>
+              <w:rPr>
+                <w:rFonts w:ascii="Arial" w:hAnsi="Arial" w:cs="Arial"/>
+                <w:sz w:val="16"/>
+                <w:szCs w:val="16"/>
               </w:rPr>
               <w:t>{{filiacao2_civil}}</w:t>
             </w:r>
@@ -26214,7 +26232,6 @@
           <w:p>
             <w:pPr>
               <w:spacing w:after="0" w:line="240" w:lineRule="auto"/>
-              <w:jc w:val="center"/>
               <w:rPr>
                 <w:sz w:val="14"/>
                 <w:szCs w:val="14"/>
@@ -32054,14 +32071,7 @@
                 <w:sz w:val="18"/>
                 <w:szCs w:val="18"/>
               </w:rPr>
-              <w:t>}}</w:t>
-            </w:r>
-            <w:r>
-              <w:rPr>
-                <w:sz w:val="18"/>
-                <w:szCs w:val="18"/>
-              </w:rPr>
-              <w:t xml:space="preserve"> </w:t>
+              <w:t xml:space="preserve">}} </w:t>
             </w:r>
             <w:r>
               <w:rPr>

</xml_diff>